<commit_message>
feat: add a new testimonial
</commit_message>
<xml_diff>
--- a/docs/testimonials-answere/testimonial-details.docx
+++ b/docs/testimonials-answere/testimonial-details.docx
@@ -129,8 +129,9 @@
           <w:szCs w:val="21"/>
           <w:shd w:val="clear" w:color="auto" w:fill="FFFFFF"/>
         </w:rPr>
-        <w:t>W</w:t>
-      </w:r>
+        <w:t xml:space="preserve">Worked with Rodrigo across several team projects at Mission Ready and he was always someone I could rely on. He took the lead on a lot of our team organisation, kept communication going and was always willing to jump in and help when one of us was stuck. He is </w:t>
+      </w:r>
+      <w:proofErr w:type="gramStart"/>
       <w:r>
         <w:rPr>
           <w:rFonts w:ascii="Segoe UI" w:hAnsi="Segoe UI" w:cs="Segoe UI"/>
@@ -139,8 +140,9 @@
           <w:szCs w:val="21"/>
           <w:shd w:val="clear" w:color="auto" w:fill="FFFFFF"/>
         </w:rPr>
-        <w:t>orked with Rodrigo across several team projects at Mission Ready and he was always someone I could rely on. He took the lead on a lot of our team organisation, kept communication going and was always willing to jump in and help when one of us was stuck. He is really strong technically, but what stood out to me most was his patience and the way he worked with the rest of the team rather than just focusing on his own part. I really enjoyed working with him and would happily work with him again.</w:t>
-      </w:r>
+        <w:t>really strong</w:t>
+      </w:r>
+      <w:proofErr w:type="gramEnd"/>
       <w:r>
         <w:rPr>
           <w:rFonts w:ascii="Segoe UI" w:hAnsi="Segoe UI" w:cs="Segoe UI"/>
@@ -149,7 +151,7 @@
           <w:szCs w:val="21"/>
           <w:shd w:val="clear" w:color="auto" w:fill="FFFFFF"/>
         </w:rPr>
-        <w:br/>
+        <w:t xml:space="preserve"> technically, but what stood out to me most was his patience and the way he worked with the rest of the team rather than just focusing on his own part. I really enjoyed working with him and would happily work with him again.</w:t>
       </w:r>
       <w:r>
         <w:rPr>
@@ -163,59 +165,6 @@
       </w:r>
       <w:r>
         <w:rPr>
-          <w:b/>
-          <w:bCs/>
-        </w:rPr>
-        <w:t>Mobile</w:t>
-      </w:r>
-      <w:r>
-        <w:rPr>
-          <w:b/>
-          <w:bCs/>
-        </w:rPr>
-        <w:t xml:space="preserve">: </w:t>
-      </w:r>
-      <w:r>
-        <w:t>0223951139</w:t>
-      </w:r>
-      <w:r>
-        <w:rPr>
-          <w:b/>
-          <w:bCs/>
-        </w:rPr>
-        <w:br/>
-        <w:t xml:space="preserve">Email: </w:t>
-      </w:r>
-      <w:r>
-        <w:t>siomckinney.dev@gmail.com</w:t>
-      </w:r>
-      <w:r>
-        <w:rPr>
-          <w:b/>
-          <w:bCs/>
-        </w:rPr>
-        <w:br/>
-        <w:t xml:space="preserve">LinkedIn: </w:t>
-      </w:r>
-      <w:r>
-        <w:t>https://www.linkedin.com/in/sio-mckinney-934700283/</w:t>
-      </w:r>
-      <w:r>
-        <w:rPr>
-          <w:b/>
-          <w:bCs/>
-        </w:rPr>
-        <w:br/>
-        <w:t>GitHub:</w:t>
-      </w:r>
-      <w:r>
-        <w:t xml:space="preserve"> </w:t>
-      </w:r>
-      <w:r>
-        <w:t>https://github.com/MasterJedi-crypto</w:t>
-      </w:r>
-      <w:r>
-        <w:rPr>
           <w:rFonts w:ascii="Segoe UI" w:hAnsi="Segoe UI" w:cs="Segoe UI"/>
           <w:color w:val="212121"/>
           <w:sz w:val="21"/>
@@ -226,6 +175,59 @@
       </w:r>
       <w:r>
         <w:rPr>
+          <w:b/>
+          <w:bCs/>
+        </w:rPr>
+        <w:t>Mobile</w:t>
+      </w:r>
+      <w:r>
+        <w:rPr>
+          <w:b/>
+          <w:bCs/>
+        </w:rPr>
+        <w:t xml:space="preserve">: </w:t>
+      </w:r>
+      <w:r>
+        <w:t>0223951139</w:t>
+      </w:r>
+      <w:r>
+        <w:rPr>
+          <w:b/>
+          <w:bCs/>
+        </w:rPr>
+        <w:br/>
+        <w:t xml:space="preserve">Email: </w:t>
+      </w:r>
+      <w:r>
+        <w:t>siomckinney.dev@gmail.com</w:t>
+      </w:r>
+      <w:r>
+        <w:rPr>
+          <w:b/>
+          <w:bCs/>
+        </w:rPr>
+        <w:br/>
+        <w:t xml:space="preserve">LinkedIn: </w:t>
+      </w:r>
+      <w:r>
+        <w:t>https://www.linkedin.com/in/sio-mckinney-934700283/</w:t>
+      </w:r>
+      <w:r>
+        <w:rPr>
+          <w:b/>
+          <w:bCs/>
+        </w:rPr>
+        <w:br/>
+        <w:t>GitHub:</w:t>
+      </w:r>
+      <w:r>
+        <w:t xml:space="preserve"> </w:t>
+      </w:r>
+      <w:r>
+        <w:t>https://github.com/MasterJedi-crypto</w:t>
+      </w:r>
+      <w:r>
+        <w:rPr>
           <w:rFonts w:ascii="Segoe UI" w:hAnsi="Segoe UI" w:cs="Segoe UI"/>
           <w:color w:val="212121"/>
           <w:sz w:val="21"/>
@@ -236,6 +238,16 @@
       </w:r>
       <w:r>
         <w:rPr>
+          <w:rFonts w:ascii="Segoe UI" w:hAnsi="Segoe UI" w:cs="Segoe UI"/>
+          <w:color w:val="212121"/>
+          <w:sz w:val="21"/>
+          <w:szCs w:val="21"/>
+          <w:shd w:val="clear" w:color="auto" w:fill="FFFFFF"/>
+        </w:rPr>
+        <w:br/>
+      </w:r>
+      <w:r>
+        <w:rPr>
           <w:b/>
           <w:bCs/>
         </w:rPr>
@@ -247,104 +259,355 @@
           <w:bCs/>
         </w:rPr>
         <w:t xml:space="preserve"> Ford</w:t>
+      </w:r>
+    </w:p>
+    <w:p>
+      <w:r>
+        <w:rPr>
+          <w:rFonts w:ascii="Segoe UI" w:hAnsi="Segoe UI" w:cs="Segoe UI"/>
+          <w:color w:val="212121"/>
+          <w:sz w:val="21"/>
+          <w:szCs w:val="21"/>
+          <w:shd w:val="clear" w:color="auto" w:fill="F8F8F8"/>
+        </w:rPr>
+        <w:t>I was lucky enough to train Rodrigo for Level 5 at Mission Ready. He is a great student and open to feedback, always eager to improve his skills.</w:t>
+      </w:r>
+      <w:r>
+        <w:rPr>
+          <w:rFonts w:ascii="Segoe UI" w:hAnsi="Segoe UI" w:cs="Segoe UI"/>
+          <w:color w:val="212121"/>
+          <w:sz w:val="21"/>
+          <w:szCs w:val="21"/>
+          <w:shd w:val="clear" w:color="auto" w:fill="F8F8F8"/>
+        </w:rPr>
+        <w:br/>
+      </w:r>
+      <w:r>
+        <w:rPr>
+          <w:rFonts w:ascii="Segoe UI" w:hAnsi="Segoe UI" w:cs="Segoe UI"/>
+          <w:color w:val="212121"/>
+          <w:sz w:val="21"/>
+          <w:szCs w:val="21"/>
+          <w:shd w:val="clear" w:color="auto" w:fill="F8F8F8"/>
+        </w:rPr>
+        <w:br/>
+      </w:r>
+      <w:r>
+        <w:rPr>
+          <w:b/>
+          <w:bCs/>
+        </w:rPr>
+        <w:t>Mobile</w:t>
+      </w:r>
+      <w:r>
+        <w:rPr>
+          <w:b/>
+          <w:bCs/>
+        </w:rPr>
+        <w:t xml:space="preserve">: </w:t>
+      </w:r>
+      <w:r>
+        <w:t>02</w:t>
+      </w:r>
+      <w:r>
+        <w:t>11197491</w:t>
+      </w:r>
+      <w:r>
+        <w:rPr>
+          <w:b/>
+          <w:bCs/>
+        </w:rPr>
+        <w:br/>
+        <w:t xml:space="preserve">Email: </w:t>
+      </w:r>
+      <w:r>
+        <w:t>andrew@andrew</w:t>
+      </w:r>
+      <w:r>
+        <w:t>ford.com</w:t>
+      </w:r>
+      <w:r>
+        <w:rPr>
+          <w:b/>
+          <w:bCs/>
+        </w:rPr>
+        <w:br/>
+        <w:t xml:space="preserve">LinkedIn: </w:t>
+      </w:r>
+      <w:r>
+        <w:t>https://www.linkedin.com/in/andrewjamesford/</w:t>
+      </w:r>
+      <w:r>
+        <w:rPr>
+          <w:b/>
+          <w:bCs/>
+        </w:rPr>
+        <w:br/>
+        <w:t>GitHub:</w:t>
+      </w:r>
+      <w:r>
+        <w:t xml:space="preserve"> </w:t>
+      </w:r>
+      <w:hyperlink r:id="rId4" w:history="1">
+        <w:r>
+          <w:rPr>
+            <w:rStyle w:val="Hyperlink"/>
+          </w:rPr>
+          <w:t>https://github.com/andrewjamesford</w:t>
+        </w:r>
+      </w:hyperlink>
+    </w:p>
+    <w:p/>
+    <w:p/>
+    <w:p/>
+    <w:p/>
+    <w:p>
+      <w:pPr>
+        <w:rPr>
+          <w:rFonts w:ascii="Segoe UI" w:eastAsia="Times New Roman" w:hAnsi="Segoe UI" w:cs="Segoe UI"/>
+          <w:color w:val="212121"/>
+          <w:kern w:val="0"/>
+          <w:lang w:eastAsia="en-NZ"/>
+          <w14:ligatures w14:val="none"/>
+        </w:rPr>
+      </w:pPr>
+      <w:r>
+        <w:rPr>
+          <w:b/>
+          <w:bCs/>
+        </w:rPr>
+        <w:lastRenderedPageBreak/>
+        <w:t>Bonnie Wall</w:t>
+      </w:r>
+      <w:r>
+        <w:rPr>
+          <w:rFonts w:ascii="Segoe UI" w:eastAsia="Times New Roman" w:hAnsi="Segoe UI" w:cs="Segoe UI"/>
+          <w:color w:val="212121"/>
+          <w:kern w:val="0"/>
+          <w:lang w:eastAsia="en-NZ"/>
+          <w14:ligatures w14:val="none"/>
+        </w:rPr>
+        <w:br/>
+        <w:t>Rodrigo was an enthusiastic candidate with Mission Ready. He was inquisitive, personable, always ready to discuss and try new ideas. He was an active member of his team, who encouraged others and devised methods to increase collaboration and progress projects. He showed a good ability to refactor and write clean, minimal code. He was conscious of best practices and strived to follow them, as evidenced in his descriptive commit history in GitHub. Rodrigo is dependable, positive and has a future-focused approach to coding.</w:t>
       </w:r>
     </w:p>
     <w:p>
       <w:pPr>
         <w:rPr>
-          <w:b/>
-          <w:bCs/>
+          <w:rFonts w:ascii="Segoe UI" w:eastAsia="Times New Roman" w:hAnsi="Segoe UI" w:cs="Segoe UI"/>
+          <w:b/>
+          <w:bCs/>
+          <w:color w:val="212121"/>
+          <w:kern w:val="0"/>
+          <w:lang w:eastAsia="en-NZ"/>
+          <w14:ligatures w14:val="none"/>
         </w:rPr>
       </w:pPr>
       <w:r>
         <w:rPr>
-          <w:rFonts w:ascii="Segoe UI" w:hAnsi="Segoe UI" w:cs="Segoe UI"/>
-          <w:color w:val="212121"/>
-          <w:sz w:val="21"/>
-          <w:szCs w:val="21"/>
-          <w:shd w:val="clear" w:color="auto" w:fill="F8F8F8"/>
-        </w:rPr>
-        <w:t>I was lucky enough to train Rodrigo for Level 5 at Mission Ready. He is a great student and open to feedback, always eager to improve his skills.</w:t>
-      </w:r>
-      <w:r>
-        <w:rPr>
-          <w:rFonts w:ascii="Segoe UI" w:hAnsi="Segoe UI" w:cs="Segoe UI"/>
-          <w:color w:val="212121"/>
-          <w:sz w:val="21"/>
-          <w:szCs w:val="21"/>
-          <w:shd w:val="clear" w:color="auto" w:fill="F8F8F8"/>
-        </w:rPr>
-        <w:br/>
-      </w:r>
-      <w:r>
-        <w:rPr>
-          <w:rFonts w:ascii="Segoe UI" w:hAnsi="Segoe UI" w:cs="Segoe UI"/>
-          <w:color w:val="212121"/>
-          <w:sz w:val="21"/>
-          <w:szCs w:val="21"/>
-          <w:shd w:val="clear" w:color="auto" w:fill="F8F8F8"/>
-        </w:rPr>
-        <w:br/>
-      </w:r>
-      <w:r>
-        <w:rPr>
-          <w:b/>
-          <w:bCs/>
+          <w:rFonts w:ascii="Segoe UI" w:eastAsia="Times New Roman" w:hAnsi="Segoe UI" w:cs="Segoe UI"/>
+          <w:b/>
+          <w:bCs/>
+          <w:color w:val="212121"/>
+          <w:kern w:val="0"/>
+          <w:lang w:eastAsia="en-NZ"/>
+          <w14:ligatures w14:val="none"/>
         </w:rPr>
         <w:t>Mobile</w:t>
       </w:r>
       <w:r>
         <w:rPr>
-          <w:b/>
-          <w:bCs/>
-        </w:rPr>
-        <w:t xml:space="preserve">: </w:t>
-      </w:r>
-      <w:r>
-        <w:t>02</w:t>
-      </w:r>
-      <w:r>
-        <w:t>11197491</w:t>
-      </w:r>
-      <w:r>
-        <w:rPr>
-          <w:b/>
-          <w:bCs/>
-        </w:rPr>
-        <w:br/>
-        <w:t xml:space="preserve">Email: </w:t>
-      </w:r>
-      <w:r>
-        <w:t>andrew@andrew</w:t>
-      </w:r>
-      <w:r>
-        <w:t>ford.com</w:t>
-      </w:r>
-      <w:r>
-        <w:rPr>
-          <w:b/>
-          <w:bCs/>
-        </w:rPr>
-        <w:br/>
-        <w:t xml:space="preserve">LinkedIn: </w:t>
-      </w:r>
-      <w:r>
-        <w:t>https://www.linkedin.com/in/andrewjamesford/</w:t>
-      </w:r>
-      <w:r>
-        <w:rPr>
-          <w:b/>
-          <w:bCs/>
-        </w:rPr>
-        <w:br/>
+          <w:rFonts w:ascii="Segoe UI" w:eastAsia="Times New Roman" w:hAnsi="Segoe UI" w:cs="Segoe UI"/>
+          <w:b/>
+          <w:bCs/>
+          <w:color w:val="212121"/>
+          <w:kern w:val="0"/>
+          <w:lang w:eastAsia="en-NZ"/>
+          <w14:ligatures w14:val="none"/>
+        </w:rPr>
+        <w:t>:</w:t>
+      </w:r>
+      <w:r>
+        <w:rPr>
+          <w:rFonts w:ascii="Segoe UI" w:eastAsia="Times New Roman" w:hAnsi="Segoe UI" w:cs="Segoe UI"/>
+          <w:b/>
+          <w:bCs/>
+          <w:color w:val="212121"/>
+          <w:kern w:val="0"/>
+          <w:lang w:eastAsia="en-NZ"/>
+          <w14:ligatures w14:val="none"/>
+        </w:rPr>
+        <w:t xml:space="preserve"> </w:t>
+      </w:r>
+      <w:r>
+        <w:rPr>
+          <w:rFonts w:ascii="Segoe UI" w:eastAsia="Times New Roman" w:hAnsi="Segoe UI" w:cs="Segoe UI"/>
+          <w:color w:val="212121"/>
+          <w:kern w:val="0"/>
+          <w:lang w:eastAsia="en-NZ"/>
+          <w14:ligatures w14:val="none"/>
+        </w:rPr>
+        <w:t>N/A contacts available on request</w:t>
+      </w:r>
+    </w:p>
+    <w:p>
+      <w:pPr>
+        <w:rPr>
+          <w:rFonts w:ascii="Segoe UI" w:eastAsia="Times New Roman" w:hAnsi="Segoe UI" w:cs="Segoe UI"/>
+          <w:b/>
+          <w:bCs/>
+          <w:color w:val="212121"/>
+          <w:kern w:val="0"/>
+          <w:lang w:eastAsia="en-NZ"/>
+          <w14:ligatures w14:val="none"/>
+        </w:rPr>
+      </w:pPr>
+      <w:r>
+        <w:rPr>
+          <w:rFonts w:ascii="Segoe UI" w:eastAsia="Times New Roman" w:hAnsi="Segoe UI" w:cs="Segoe UI"/>
+          <w:b/>
+          <w:bCs/>
+          <w:color w:val="212121"/>
+          <w:kern w:val="0"/>
+          <w:lang w:eastAsia="en-NZ"/>
+          <w14:ligatures w14:val="none"/>
+        </w:rPr>
+        <w:t>Email:</w:t>
+      </w:r>
+      <w:r>
+        <w:rPr>
+          <w:rFonts w:ascii="Segoe UI" w:eastAsia="Times New Roman" w:hAnsi="Segoe UI" w:cs="Segoe UI"/>
+          <w:b/>
+          <w:bCs/>
+          <w:color w:val="212121"/>
+          <w:kern w:val="0"/>
+          <w:lang w:eastAsia="en-NZ"/>
+          <w14:ligatures w14:val="none"/>
+        </w:rPr>
+        <w:t xml:space="preserve"> </w:t>
+      </w:r>
+      <w:r>
+        <w:rPr>
+          <w:rFonts w:ascii="Segoe UI" w:eastAsia="Times New Roman" w:hAnsi="Segoe UI" w:cs="Segoe UI"/>
+          <w:color w:val="212121"/>
+          <w:kern w:val="0"/>
+          <w:lang w:eastAsia="en-NZ"/>
+          <w14:ligatures w14:val="none"/>
+        </w:rPr>
+        <w:t>bonniew@missionreadyhq.com</w:t>
+      </w:r>
+    </w:p>
+    <w:p>
+      <w:pPr>
+        <w:rPr>
+          <w:rFonts w:ascii="Segoe UI" w:eastAsia="Times New Roman" w:hAnsi="Segoe UI" w:cs="Segoe UI"/>
+          <w:b/>
+          <w:bCs/>
+          <w:color w:val="212121"/>
+          <w:kern w:val="0"/>
+          <w:lang w:eastAsia="en-NZ"/>
+          <w14:ligatures w14:val="none"/>
+        </w:rPr>
+      </w:pPr>
+      <w:r>
+        <w:rPr>
+          <w:rFonts w:ascii="Segoe UI" w:eastAsia="Times New Roman" w:hAnsi="Segoe UI" w:cs="Segoe UI"/>
+          <w:b/>
+          <w:bCs/>
+          <w:color w:val="212121"/>
+          <w:kern w:val="0"/>
+          <w:lang w:eastAsia="en-NZ"/>
+          <w14:ligatures w14:val="none"/>
+        </w:rPr>
+        <w:t>LinkedIn:</w:t>
+      </w:r>
+      <w:r>
+        <w:rPr>
+          <w:rFonts w:ascii="Segoe UI" w:eastAsia="Times New Roman" w:hAnsi="Segoe UI" w:cs="Segoe UI"/>
+          <w:b/>
+          <w:bCs/>
+          <w:color w:val="212121"/>
+          <w:kern w:val="0"/>
+          <w:lang w:eastAsia="en-NZ"/>
+          <w14:ligatures w14:val="none"/>
+        </w:rPr>
+        <w:t xml:space="preserve"> </w:t>
+      </w:r>
+      <w:r>
+        <w:rPr>
+          <w:rFonts w:ascii="Segoe UI" w:eastAsia="Times New Roman" w:hAnsi="Segoe UI" w:cs="Segoe UI"/>
+          <w:color w:val="212121"/>
+          <w:kern w:val="0"/>
+          <w:lang w:eastAsia="en-NZ"/>
+          <w14:ligatures w14:val="none"/>
+        </w:rPr>
+        <w:t>w</w:t>
+      </w:r>
+      <w:r>
+        <w:rPr>
+          <w:rFonts w:ascii="Segoe UI" w:eastAsia="Times New Roman" w:hAnsi="Segoe UI" w:cs="Segoe UI"/>
+          <w:color w:val="212121"/>
+          <w:kern w:val="0"/>
+          <w:lang w:eastAsia="en-NZ"/>
+          <w14:ligatures w14:val="none"/>
+        </w:rPr>
+        <w:t>ww.linkedin.com/in/bonnie-wall</w:t>
+      </w:r>
+    </w:p>
+    <w:p>
+      <w:pPr>
+        <w:rPr>
+          <w:rFonts w:ascii="Segoe UI" w:eastAsia="Times New Roman" w:hAnsi="Segoe UI" w:cs="Segoe UI"/>
+          <w:b/>
+          <w:bCs/>
+          <w:color w:val="212121"/>
+          <w:kern w:val="0"/>
+          <w:lang w:eastAsia="en-NZ"/>
+          <w14:ligatures w14:val="none"/>
+        </w:rPr>
+      </w:pPr>
+      <w:r>
+        <w:rPr>
+          <w:rFonts w:ascii="Segoe UI" w:eastAsia="Times New Roman" w:hAnsi="Segoe UI" w:cs="Segoe UI"/>
+          <w:b/>
+          <w:bCs/>
+          <w:color w:val="212121"/>
+          <w:kern w:val="0"/>
+          <w:lang w:eastAsia="en-NZ"/>
+          <w14:ligatures w14:val="none"/>
+        </w:rPr>
         <w:t>GitHub:</w:t>
       </w:r>
       <w:r>
+        <w:rPr>
+          <w:rFonts w:ascii="Segoe UI" w:eastAsia="Times New Roman" w:hAnsi="Segoe UI" w:cs="Segoe UI"/>
+          <w:b/>
+          <w:bCs/>
+          <w:color w:val="212121"/>
+          <w:kern w:val="0"/>
+          <w:lang w:eastAsia="en-NZ"/>
+          <w14:ligatures w14:val="none"/>
+        </w:rPr>
         <w:t xml:space="preserve"> </w:t>
       </w:r>
       <w:r>
-        <w:t>https://github.com/andrewjamesford</w:t>
-      </w:r>
+        <w:rPr>
+          <w:rFonts w:ascii="Segoe UI" w:eastAsia="Times New Roman" w:hAnsi="Segoe UI" w:cs="Segoe UI"/>
+          <w:color w:val="212121"/>
+          <w:kern w:val="0"/>
+          <w:lang w:eastAsia="en-NZ"/>
+          <w14:ligatures w14:val="none"/>
+        </w:rPr>
+        <w:t>https://github.com/bonne-bonne</w:t>
+      </w:r>
+    </w:p>
+    <w:p>
+      <w:pPr>
+        <w:rPr>
+          <w:b/>
+          <w:bCs/>
+        </w:rPr>
+      </w:pPr>
     </w:p>
     <w:sectPr>
       <w:pgSz w:w="11906" w:h="16838"/>
@@ -1272,6 +1535,34 @@
       <w:spacing w:val="5"/>
     </w:rPr>
   </w:style>
+  <w:style w:type="character" w:styleId="Hyperlink">
+    <w:name w:val="Hyperlink"/>
+    <w:basedOn w:val="DefaultParagraphFont"/>
+    <w:uiPriority w:val="99"/>
+    <w:unhideWhenUsed/>
+    <w:rsid w:val="0035008E"/>
+    <w:rPr>
+      <w:color w:val="467886" w:themeColor="hyperlink"/>
+      <w:u w:val="single"/>
+    </w:rPr>
+  </w:style>
+  <w:style w:type="character" w:styleId="UnresolvedMention">
+    <w:name w:val="Unresolved Mention"/>
+    <w:basedOn w:val="DefaultParagraphFont"/>
+    <w:uiPriority w:val="99"/>
+    <w:semiHidden/>
+    <w:unhideWhenUsed/>
+    <w:rsid w:val="0035008E"/>
+    <w:rPr>
+      <w:color w:val="605E5C"/>
+      <w:shd w:val="clear" w:color="auto" w:fill="E1DFDD"/>
+    </w:rPr>
+  </w:style>
+  <w:style w:type="character" w:customStyle="1" w:styleId="--o-703">
+    <w:name w:val="-_-o-703"/>
+    <w:basedOn w:val="DefaultParagraphFont"/>
+    <w:rsid w:val="0035008E"/>
+  </w:style>
 </w:styles>
 </file>
 

</xml_diff>